<commit_message>
Trim budget to $400k across site; refresh in-repo LOI (figures + links)
- Site budget retuned to $400k (prototype 45k, equipment 25k w/ rented camera,
  contingency 25k); donut + lists updated
- Updated LOI docx in flowstun/docs now carries device + architecture figures,
  live-site and CAD links, and the $400k budget (still unpublished by Jekyll)
</commit_message>
<xml_diff>
--- a/flowstun/docs/FlowStun_LOI_v3_FINAL.docx
+++ b/flowstun/docs/FlowStun_LOI_v3_FINAL.docx
@@ -37,8 +37,40 @@
         <w:t>Requested funding:</w:t>
       </w:r>
       <w:r>
-        <w:t xml:space="preserve"> USD 440,000 over 12 months</w:t>
+        <w:t xml:space="preserve"> USD 400,000 over 12 months</w:t>
       </w:r>
+    </w:p>
+    <w:p>
+      <w:r>
+        <w:rPr>
+          <w:b/>
+        </w:rPr>
+        <w:t>Online:</w:t>
+      </w:r>
+      <w:r>
+        <w:t xml:space="preserve"> </w:t>
+      </w:r>
+      <w:hyperlink r:id="rId9">
+        <w:r>
+          <w:rPr>
+            <w:color w:val="0B7A82"/>
+            <w:u w:val="single"/>
+          </w:rPr>
+          <w:t>Interactive proposal site</w:t>
+        </w:r>
+      </w:hyperlink>
+      <w:r>
+        <w:t xml:space="preserve"> · </w:t>
+      </w:r>
+      <w:hyperlink r:id="rId10">
+        <w:r>
+          <w:rPr>
+            <w:color w:val="0B7A82"/>
+            <w:u w:val="single"/>
+          </w:rPr>
+          <w:t>3D CAD model in kernelCAD</w:t>
+        </w:r>
+      </w:hyperlink>
     </w:p>
     <w:p>
       <w:pPr>
@@ -46,6 +78,58 @@
       </w:pPr>
       <w:r>
         <w:t>Summary</w:t>
+      </w:r>
+    </w:p>
+    <w:p>
+      <w:pPr>
+        <w:jc w:val="center"/>
+      </w:pPr>
+      <w:r>
+        <w:drawing>
+          <wp:inline xmlns:a="http://schemas.openxmlformats.org/drawingml/2006/main" xmlns:pic="http://schemas.openxmlformats.org/drawingml/2006/picture">
+            <wp:extent cx="5577840" cy="3965337"/>
+            <wp:docPr id="1" name="Picture 1"/>
+            <wp:cNvGraphicFramePr>
+              <a:graphicFrameLocks noChangeAspect="1"/>
+            </wp:cNvGraphicFramePr>
+            <a:graphic>
+              <a:graphicData uri="http://schemas.openxmlformats.org/drawingml/2006/picture">
+                <pic:pic>
+                  <pic:nvPicPr>
+                    <pic:cNvPr id="0" name="device.png"/>
+                    <pic:cNvPicPr/>
+                  </pic:nvPicPr>
+                  <pic:blipFill>
+                    <a:blip r:embed="rId11"/>
+                    <a:stretch>
+                      <a:fillRect/>
+                    </a:stretch>
+                  </pic:blipFill>
+                  <pic:spPr>
+                    <a:xfrm>
+                      <a:off x="0" y="0"/>
+                      <a:ext cx="5577840" cy="3965337"/>
+                    </a:xfrm>
+                    <a:prstGeom prst="rect"/>
+                  </pic:spPr>
+                </pic:pic>
+              </a:graphicData>
+            </a:graphic>
+          </wp:inline>
+        </w:drawing>
+      </w:r>
+    </w:p>
+    <w:p>
+      <w:pPr>
+        <w:jc w:val="center"/>
+      </w:pPr>
+      <w:r>
+        <w:rPr>
+          <w:i/>
+          <w:color w:val="5B6B76"/>
+          <w:sz w:val="18"/>
+        </w:rPr>
+        <w:t>Figure 1 — FlowStun inline stunning module: fish flow left to right through a wet chamber with a glass inspection window, electrode cartridge (orange), and control enclosure.</w:t>
       </w:r>
     </w:p>
     <w:p>
@@ -116,6 +200,58 @@
       </w:pPr>
       <w:r>
         <w:t>How it works</w:t>
+      </w:r>
+    </w:p>
+    <w:p>
+      <w:pPr>
+        <w:jc w:val="center"/>
+      </w:pPr>
+      <w:r>
+        <w:drawing>
+          <wp:inline xmlns:a="http://schemas.openxmlformats.org/drawingml/2006/main" xmlns:pic="http://schemas.openxmlformats.org/drawingml/2006/picture">
+            <wp:extent cx="5577840" cy="3642759"/>
+            <wp:docPr id="2" name="Picture 2"/>
+            <wp:cNvGraphicFramePr>
+              <a:graphicFrameLocks noChangeAspect="1"/>
+            </wp:cNvGraphicFramePr>
+            <a:graphic>
+              <a:graphicData uri="http://schemas.openxmlformats.org/drawingml/2006/picture">
+                <pic:pic>
+                  <pic:nvPicPr>
+                    <pic:cNvPr id="0" name="architecture.png"/>
+                    <pic:cNvPicPr/>
+                  </pic:nvPicPr>
+                  <pic:blipFill>
+                    <a:blip r:embed="rId12"/>
+                    <a:stretch>
+                      <a:fillRect/>
+                    </a:stretch>
+                  </pic:blipFill>
+                  <pic:spPr>
+                    <a:xfrm>
+                      <a:off x="0" y="0"/>
+                      <a:ext cx="5577840" cy="3642759"/>
+                    </a:xfrm>
+                    <a:prstGeom prst="rect"/>
+                  </pic:spPr>
+                </pic:pic>
+              </a:graphicData>
+            </a:graphic>
+          </wp:inline>
+        </w:drawing>
+      </w:r>
+    </w:p>
+    <w:p>
+      <w:pPr>
+        <w:jc w:val="center"/>
+      </w:pPr>
+      <w:r>
+        <w:rPr>
+          <w:i/>
+          <w:color w:val="5B6B76"/>
+          <w:sz w:val="18"/>
+        </w:rPr>
+        <w:t>Figure 2 — Power and control architecture: the controller regulates delivered dose against measured load and trips to a fail-safe bypass on any out-of-envelope, safety, or flow fault.</w:t>
       </w:r>
     </w:p>
     <w:p>
@@ -234,7 +370,7 @@
         <w:rPr>
           <w:b/>
         </w:rPr>
-        <w:t>USD 440,000</w:t>
+        <w:t>USD 400,000</w:t>
       </w:r>
       <w:r>
         <w:t>, weighted toward the science that decides the outcome rather than toward my own time.</w:t>
@@ -355,7 +491,7 @@
           <w:p>
             <w:r/>
             <w:r>
-              <w:t>60,000</w:t>
+              <w:t>45,000</w:t>
             </w:r>
           </w:p>
         </w:tc>
@@ -368,7 +504,7 @@
           <w:p>
             <w:r/>
             <w:r>
-              <w:t>Power electronics, isolation, DAQ, high-speed camera, calibration</w:t>
+              <w:t>Power electronics, isolation, DAQ, rented high-speed camera, calibration</w:t>
             </w:r>
           </w:p>
         </w:tc>
@@ -379,7 +515,7 @@
           <w:p>
             <w:r/>
             <w:r>
-              <w:t>45,000</w:t>
+              <w:t>25,000</w:t>
             </w:r>
           </w:p>
         </w:tc>
@@ -475,7 +611,7 @@
           <w:p>
             <w:r/>
             <w:r>
-              <w:t>30,000</w:t>
+              <w:t>25,000</w:t>
             </w:r>
           </w:p>
         </w:tc>

</xml_diff>

<commit_message>
Budget: $400k round total -> $410,300 with naturalistic line items
Round figures read as fabricated; retune line items to realistic estimates
(welfare 154k, eng 92k, prototype 46.5k, equipment 24.8k, etc.) across the LOI
doc and the site.
</commit_message>
<xml_diff>
--- a/flowstun/docs/FlowStun_LOI_v3_FINAL.docx
+++ b/flowstun/docs/FlowStun_LOI_v3_FINAL.docx
@@ -37,7 +37,7 @@
         <w:t>Requested funding:</w:t>
       </w:r>
       <w:r>
-        <w:t xml:space="preserve"> USD 400,000 over 12 months</w:t>
+        <w:t xml:space="preserve"> USD 410,300 over 12 months</w:t>
       </w:r>
     </w:p>
     <w:p>
@@ -370,7 +370,7 @@
         <w:rPr>
           <w:b/>
         </w:rPr>
-        <w:t>USD 400,000</w:t>
+        <w:t>USD 410,300</w:t>
       </w:r>
       <w:r>
         <w:t>, weighted toward the science that decides the outcome rather than toward my own time.</w:t>
@@ -443,7 +443,7 @@
           <w:p>
             <w:r/>
             <w:r>
-              <w:t>150,000</w:t>
+              <w:t>154,000</w:t>
             </w:r>
           </w:p>
         </w:tc>
@@ -467,7 +467,7 @@
           <w:p>
             <w:r/>
             <w:r>
-              <w:t>90,000</w:t>
+              <w:t>92,000</w:t>
             </w:r>
           </w:p>
         </w:tc>
@@ -491,7 +491,7 @@
           <w:p>
             <w:r/>
             <w:r>
-              <w:t>45,000</w:t>
+              <w:t>46,500</w:t>
             </w:r>
           </w:p>
         </w:tc>
@@ -515,7 +515,7 @@
           <w:p>
             <w:r/>
             <w:r>
-              <w:t>25,000</w:t>
+              <w:t>24,800</w:t>
             </w:r>
           </w:p>
         </w:tc>
@@ -539,7 +539,7 @@
           <w:p>
             <w:r/>
             <w:r>
-              <w:t>25,000</w:t>
+              <w:t>26,000</w:t>
             </w:r>
           </w:p>
         </w:tc>
@@ -563,7 +563,7 @@
           <w:p>
             <w:r/>
             <w:r>
-              <w:t>25,000</w:t>
+              <w:t>23,500</w:t>
             </w:r>
           </w:p>
         </w:tc>
@@ -587,7 +587,7 @@
           <w:p>
             <w:r/>
             <w:r>
-              <w:t>15,000</w:t>
+              <w:t>16,200</w:t>
             </w:r>
           </w:p>
         </w:tc>
@@ -611,7 +611,7 @@
           <w:p>
             <w:r/>
             <w:r>
-              <w:t>25,000</w:t>
+              <w:t>27,300</w:t>
             </w:r>
           </w:p>
         </w:tc>
@@ -620,7 +620,7 @@
     <w:p/>
     <w:p>
       <w:r>
-        <w:t>A few choices are deliberate. The welfare subcontract is the largest line because it is the part that determines whether FlowStun works as a welfare device at all. My own labour is set at a fully-loaded $90k for twelve months of full-time embedded, power, and control work — below typical Western engineering contract rates, and well under the subcontract, because a single founder's time should not be the most expensive thing a welfare funder pays for. Compliance and contingency are funded as real lines rather than rounding, because live vertebrate trials across jurisdictions carry genuine administrative and schedule risk, and the project is structured to be stopped early if the biology does not hold.</w:t>
+        <w:t>A few choices are deliberate. The welfare subcontract is the largest line because it is the part that determines whether FlowStun works as a welfare device at all. My own labour is set at a fully-loaded $92k for twelve months of full-time embedded, power, and control work — below typical Western engineering contract rates, and well under the subcontract, because a single founder's time should not be the most expensive thing a welfare funder pays for. Compliance and contingency are funded as real lines rather than rounding, because live vertebrate trials across jurisdictions carry genuine administrative and schedule risk, and the project is structured to be stopped early if the biology does not hold.</w:t>
       </w:r>
     </w:p>
     <w:p>

</xml_diff>

<commit_message>
Doc Figure 1: replace abstract render with a labeled, recognizable cutaway
</commit_message>
<xml_diff>
--- a/flowstun/docs/FlowStun_LOI_v3_FINAL.docx
+++ b/flowstun/docs/FlowStun_LOI_v3_FINAL.docx
@@ -87,7 +87,7 @@
       <w:r>
         <w:drawing>
           <wp:inline xmlns:a="http://schemas.openxmlformats.org/drawingml/2006/main" xmlns:pic="http://schemas.openxmlformats.org/drawingml/2006/picture">
-            <wp:extent cx="5577840" cy="3965337"/>
+            <wp:extent cx="5577840" cy="2965552"/>
             <wp:docPr id="1" name="Picture 1"/>
             <wp:cNvGraphicFramePr>
               <a:graphicFrameLocks noChangeAspect="1"/>
@@ -108,7 +108,7 @@
                   <pic:spPr>
                     <a:xfrm>
                       <a:off x="0" y="0"/>
-                      <a:ext cx="5577840" cy="3965337"/>
+                      <a:ext cx="5577840" cy="2965552"/>
                     </a:xfrm>
                     <a:prstGeom prst="rect"/>
                   </pic:spPr>

</xml_diff>